<commit_message>
cafe-app: fictional realistic names in the test-data kit (one identity per person across files)
Co-Authored-By: Claude Sonnet 5.5 <noreply@anthropic.com>
Claude-Session: https://claude.ai/code/session_01P3ov37P2fF1cuhtF4wyed3
</commit_message>
<xml_diff>
--- a/cafe-app/test-data/09-minutes.docx
+++ b/cafe-app/test-data/09-minutes.docx
@@ -12,7 +12,7 @@
     </w:p>
     <w:p>
       <w:r>
-        <w:t xml:space="preserve">Person 6, Person 4 and Person 8 met on 27 October 2026 to review progress on the Expense anomaly finder. The group confirmed the idea is still aimed at reviewers who currently sample claims by hand.</w:t>
+        <w:t xml:space="preserve">Ingrid Solberg, Noor El-Sayed and Hana Kobayashi met on 27 October 2026 to review progress on the Expense anomaly finder. The group confirmed the idea is still aimed at reviewers who currently sample claims by hand.</w:t>
       </w:r>
     </w:p>
     <w:p>
@@ -22,7 +22,7 @@
     </w:p>
     <w:p>
       <w:r>
-        <w:t xml:space="preserve">Person 4 asked for a plain-language list of the flags so reviewers can see why a claim was picked. The team will return with a first version for the next session.</w:t>
+        <w:t xml:space="preserve">Noor El-Sayed asked for a plain-language list of the flags so reviewers can see why a claim was picked. The team will return with a first version for the next session.</w:t>
       </w:r>
     </w:p>
     <w:tbl>
@@ -57,7 +57,7 @@
           <w:tcPr/>
           <w:p>
             <w:r>
-              <w:t xml:space="preserve">Person 6</w:t>
+              <w:t xml:space="preserve">Ingrid Solberg</w:t>
             </w:r>
           </w:p>
         </w:tc>
@@ -83,7 +83,7 @@
           <w:tcPr/>
           <w:p>
             <w:r>
-              <w:t xml:space="preserve">Person 8</w:t>
+              <w:t xml:space="preserve">Hana Kobayashi</w:t>
             </w:r>
           </w:p>
         </w:tc>
@@ -109,7 +109,7 @@
           <w:tcPr/>
           <w:p>
             <w:r>
-              <w:t xml:space="preserve">Person 4</w:t>
+              <w:t xml:space="preserve">Noor El-Sayed</w:t>
             </w:r>
           </w:p>
         </w:tc>

</xml_diff>